<commit_message>
ADDING TODAY'S WORK - 29.06.2026
</commit_message>
<xml_diff>
--- a/github/drafts/github_plan.docx
+++ b/github/drafts/github_plan.docx
@@ -70,7 +70,25 @@
         </w:numPr>
       </w:pPr>
       <w:r>
-        <w:t>Snakemake would be nice but not essential</w:t>
+        <w:t>Snakemake</w:t>
+      </w:r>
+      <w:r>
+        <w:t xml:space="preserve">/nextflow </w:t>
+      </w:r>
+      <w:r>
+        <w:t>would be nice but not essential</w:t>
+      </w:r>
+    </w:p>
+    <w:p>
+      <w:pPr>
+        <w:pStyle w:val="ListParagraph"/>
+        <w:numPr>
+          <w:ilvl w:val="0"/>
+          <w:numId w:val="3"/>
+        </w:numPr>
+      </w:pPr>
+      <w:r>
+        <w:t>Could name each script as the name of the methods section to make it very clear to the examiner which section is which</w:t>
       </w:r>
     </w:p>
     <w:sectPr>

</xml_diff>

<commit_message>
ADDING TODAY'S WORK - 14.07.2026
</commit_message>
<xml_diff>
--- a/github/drafts/github_plan.docx
+++ b/github/drafts/github_plan.docx
@@ -19,7 +19,15 @@
         <w:ind w:left="720" w:hanging="360"/>
       </w:pPr>
       <w:r>
-        <w:t>N.B. github won’t be marked like it was in the group projects – it just needs to be reproducible, not incredibly flashy or with lengthy descriptions</w:t>
+        <w:t xml:space="preserve">N.B. </w:t>
+      </w:r>
+      <w:proofErr w:type="spellStart"/>
+      <w:r>
+        <w:t>github</w:t>
+      </w:r>
+      <w:proofErr w:type="spellEnd"/>
+      <w:r>
+        <w:t xml:space="preserve"> won’t be marked like it was in the group projects – it just needs to be reproducible, not incredibly flashy or with lengthy descriptions</w:t>
       </w:r>
       <w:r>
         <w:t>.</w:t>
@@ -34,7 +42,15 @@
         </w:numPr>
       </w:pPr>
       <w:r>
-        <w:t>Add template script to github because this is referenced in my methods and they need to see how it looks without any script-specific info in</w:t>
+        <w:t xml:space="preserve">Add template script to </w:t>
+      </w:r>
+      <w:proofErr w:type="spellStart"/>
+      <w:r>
+        <w:t>github</w:t>
+      </w:r>
+      <w:proofErr w:type="spellEnd"/>
+      <w:r>
+        <w:t xml:space="preserve"> because this is referenced in my methods and they need to see how it looks without any script-specific info in</w:t>
       </w:r>
     </w:p>
     <w:p>
@@ -46,7 +62,15 @@
         </w:numPr>
       </w:pPr>
       <w:r>
-        <w:t>Can use mkdocs if I want to provide the level of detail I did in the coursework – matt said this is better than putting the info in the repo which just clutters it up</w:t>
+        <w:t xml:space="preserve">Can use </w:t>
+      </w:r>
+      <w:proofErr w:type="spellStart"/>
+      <w:r>
+        <w:t>mkdocs</w:t>
+      </w:r>
+      <w:proofErr w:type="spellEnd"/>
+      <w:r>
+        <w:t xml:space="preserve"> if I want to provide the level of detail I did in the coursework – matt said this is better than putting the info in the repo which just clutters it up</w:t>
       </w:r>
     </w:p>
     <w:p>
@@ -69,11 +93,21 @@
           <w:numId w:val="3"/>
         </w:numPr>
       </w:pPr>
+      <w:proofErr w:type="spellStart"/>
       <w:r>
         <w:t>Snakemake</w:t>
       </w:r>
-      <w:r>
-        <w:t xml:space="preserve">/nextflow </w:t>
+      <w:proofErr w:type="spellEnd"/>
+      <w:r>
+        <w:t>/</w:t>
+      </w:r>
+      <w:proofErr w:type="spellStart"/>
+      <w:r>
+        <w:t>nextflow</w:t>
+      </w:r>
+      <w:proofErr w:type="spellEnd"/>
+      <w:r>
+        <w:t xml:space="preserve"> </w:t>
       </w:r>
       <w:r>
         <w:t>would be nice but not essential</w:t>
@@ -89,6 +123,26 @@
       </w:pPr>
       <w:r>
         <w:t>Could name each script as the name of the methods section to make it very clear to the examiner which section is which</w:t>
+      </w:r>
+    </w:p>
+    <w:p>
+      <w:pPr>
+        <w:pStyle w:val="ListParagraph"/>
+        <w:numPr>
+          <w:ilvl w:val="0"/>
+          <w:numId w:val="3"/>
+        </w:numPr>
+      </w:pPr>
+      <w:r>
+        <w:t>Need to change 04_map_reads to ‘</w:t>
+      </w:r>
+      <w:proofErr w:type="spellStart"/>
+      <w:r>
+        <w:t>collapse_reads</w:t>
+      </w:r>
+      <w:proofErr w:type="spellEnd"/>
+      <w:r>
+        <w:t>’. Alternatively, combine script 04 and 05 – this would align nicely with the methods section</w:t>
       </w:r>
     </w:p>
     <w:sectPr>

</xml_diff>

<commit_message>
ADDING TODAY'S WORK - 15.07.2026
</commit_message>
<xml_diff>
--- a/github/drafts/github_plan.docx
+++ b/github/drafts/github_plan.docx
@@ -1,6 +1,6 @@
 
 <file path=word/document.xml><?xml version="1.0" encoding="utf-8"?>
-<w:document xmlns:wpc="http://schemas.microsoft.com/office/word/2010/wordprocessingCanvas" xmlns:cx="http://schemas.microsoft.com/office/drawing/2014/chartex" xmlns:cx1="http://schemas.microsoft.com/office/drawing/2015/9/8/chartex" xmlns:cx2="http://schemas.microsoft.com/office/drawing/2015/10/21/chartex" xmlns:cx3="http://schemas.microsoft.com/office/drawing/2016/5/9/chartex" xmlns:cx4="http://schemas.microsoft.com/office/drawing/2016/5/10/chartex" xmlns:cx5="http://schemas.microsoft.com/office/drawing/2016/5/11/chartex" xmlns:cx6="http://schemas.microsoft.com/office/drawing/2016/5/12/chartex" xmlns:cx7="http://schemas.microsoft.com/office/drawing/2016/5/13/chartex" xmlns:cx8="http://schemas.microsoft.com/office/drawing/2016/5/14/chartex" xmlns:mc="http://schemas.openxmlformats.org/markup-compatibility/2006" xmlns:m="http://schemas.openxmlformats.org/officeDocument/2006/math" xmlns:aink="http://schemas.microsoft.com/office/drawing/2016/ink" xmlns:am3d="http://schemas.microsoft.com/office/drawing/2017/model3d" xmlns:oel="http://schemas.microsoft.com/office/2019/extlst" xmlns:r="http://schemas.openxmlformats.org/officeDocument/2006/relationships" xmlns:wp14="http://schemas.microsoft.com/office/word/2010/wordprocessingDrawing" xmlns:wp="http://schemas.openxmlformats.org/drawingml/2006/wordprocessingDrawing" xmlns:wpg="http://schemas.microsoft.com/office/word/2010/wordprocessingGroup" xmlns:wpi="http://schemas.microsoft.com/office/word/2010/wordprocessingInk" xmlns:wps="http://schemas.microsoft.com/office/word/2010/wordprocessingShape" xmlns:o="urn:schemas-microsoft-com:office:office" xmlns:v="urn:schemas-microsoft-com:vml" xmlns:w10="urn:schemas-microsoft-com:office:word" xmlns:w="http://schemas.openxmlformats.org/wordprocessingml/2006/main" xmlns:w14="http://schemas.microsoft.com/office/word/2010/wordml" xmlns:w15="http://schemas.microsoft.com/office/word/2012/wordml" xmlns:w16cex="http://schemas.microsoft.com/office/word/2018/wordml/cex" xmlns:w16cid="http://schemas.microsoft.com/office/word/2016/wordml/cid" xmlns:w16="http://schemas.microsoft.com/office/word/2018/wordml" xmlns:w16sdtdh="http://schemas.microsoft.com/office/word/2020/wordml/sdtdatahash" xmlns:w16sdtfl="http://schemas.microsoft.com/office/word/2024/wordml/sdtformatlock" xmlns:w16se="http://schemas.microsoft.com/office/word/2015/wordml/symex" xmlns:w16du="http://schemas.microsoft.com/office/word/2023/wordml/word16du" xmlns:wne="http://schemas.microsoft.com/office/word/2006/wordml" mc:Ignorable="w14 w15 w16se w16cid w16 w16cex w16sdtdh w16sdtfl w16du wp14">
+<w:document xmlns:wpc="http://schemas.microsoft.com/office/word/2010/wordprocessingCanvas" xmlns:cx="http://schemas.microsoft.com/office/drawing/2014/chartex" xmlns:cx1="http://schemas.microsoft.com/office/drawing/2015/9/8/chartex" xmlns:cx2="http://schemas.microsoft.com/office/drawing/2015/10/21/chartex" xmlns:cx3="http://schemas.microsoft.com/office/drawing/2016/5/9/chartex" xmlns:cx4="http://schemas.microsoft.com/office/drawing/2016/5/10/chartex" xmlns:cx5="http://schemas.microsoft.com/office/drawing/2016/5/11/chartex" xmlns:cx6="http://schemas.microsoft.com/office/drawing/2016/5/12/chartex" xmlns:cx7="http://schemas.microsoft.com/office/drawing/2016/5/13/chartex" xmlns:cx8="http://schemas.microsoft.com/office/drawing/2016/5/14/chartex" xmlns:mc="http://schemas.openxmlformats.org/markup-compatibility/2006" xmlns:m="http://schemas.openxmlformats.org/officeDocument/2006/math" xmlns:aink="http://schemas.microsoft.com/office/drawing/2016/ink" xmlns:am3d="http://schemas.microsoft.com/office/drawing/2017/model3d" xmlns:oel="http://schemas.microsoft.com/office/2019/extlst" xmlns:r="http://schemas.openxmlformats.org/officeDocument/2006/relationships" xmlns:wp14="http://schemas.microsoft.com/office/word/2010/wordprocessingDrawing" xmlns:wp="http://schemas.openxmlformats.org/drawingml/2006/wordprocessingDrawing" xmlns:wpg="http://schemas.microsoft.com/office/word/2010/wordprocessingGroup" xmlns:wpi="http://schemas.microsoft.com/office/word/2010/wordprocessingInk" xmlns:wps="http://schemas.microsoft.com/office/word/2010/wordprocessingShape" xmlns:o="urn:schemas-microsoft-com:office:office" xmlns:v="urn:schemas-microsoft-com:vml" xmlns:w10="urn:schemas-microsoft-com:office:word" xmlns:w="http://schemas.openxmlformats.org/wordprocessingml/2006/main" xmlns:w14="http://schemas.microsoft.com/office/word/2010/wordml" xmlns:w15="http://schemas.microsoft.com/office/word/2012/wordml" xmlns:w16cei="http://schemas.microsoft.com/office/word/2026/wordml/cei" xmlns:w16cex="http://schemas.microsoft.com/office/word/2018/wordml/cex" xmlns:w16cid="http://schemas.microsoft.com/office/word/2016/wordml/cid" xmlns:w16="http://schemas.microsoft.com/office/word/2018/wordml" xmlns:w16sdtdh="http://schemas.microsoft.com/office/word/2020/wordml/sdtdatahash" xmlns:w16sdtfl="http://schemas.microsoft.com/office/word/2024/wordml/sdtformatlock" xmlns:w16se="http://schemas.microsoft.com/office/word/2015/wordml/symex" xmlns:w16du="http://schemas.microsoft.com/office/word/2023/wordml/word16du" xmlns:wne="http://schemas.microsoft.com/office/word/2006/wordml" mc:Ignorable="w14 w15 w16se w16cid w16 w16cex w16sdtdh w16sdtfl w16du wp14">
   <w:body>
     <w:p>
       <w:pPr>
@@ -144,6 +144,56 @@
       <w:r>
         <w:t>’. Alternatively, combine script 04 and 05 – this would align nicely with the methods section</w:t>
       </w:r>
+    </w:p>
+    <w:p>
+      <w:pPr>
+        <w:pStyle w:val="ListParagraph"/>
+        <w:numPr>
+          <w:ilvl w:val="0"/>
+          <w:numId w:val="3"/>
+        </w:numPr>
+      </w:pPr>
+      <w:r>
+        <w:t>P</w:t>
+      </w:r>
+      <w:r>
+        <w:t xml:space="preserve">ut a sample of the data (e.g., random subset) so that people can run the scripts to see if they work </w:t>
+      </w:r>
+      <w:r>
+        <w:rPr>
+          <w:b/>
+          <w:bCs/>
+        </w:rPr>
+        <w:t>– from lecture 3</w:t>
+      </w:r>
+      <w:r>
+        <w:rPr>
+          <w:b/>
+          <w:bCs/>
+        </w:rPr>
+        <w:t xml:space="preserve">. I have said I’ve done this in ‘code availability’ in the methods and ‘data availability’ </w:t>
+      </w:r>
+    </w:p>
+    <w:p>
+      <w:pPr>
+        <w:pStyle w:val="ListParagraph"/>
+        <w:numPr>
+          <w:ilvl w:val="1"/>
+          <w:numId w:val="3"/>
+        </w:numPr>
+      </w:pPr>
+      <w:r>
+        <w:t xml:space="preserve">Might be easier to get a random subset of a publicly available miRNA set because then don’t have to worry about getting permission from Georgie and will </w:t>
+      </w:r>
+    </w:p>
+    <w:p>
+      <w:pPr>
+        <w:pStyle w:val="ListParagraph"/>
+        <w:numPr>
+          <w:ilvl w:val="0"/>
+          <w:numId w:val="3"/>
+        </w:numPr>
+      </w:pPr>
     </w:p>
     <w:sectPr>
       <w:pgSz w:w="11906" w:h="16838"/>
@@ -156,8 +206,121 @@
 </file>
 
 <file path=word/numbering.xml><?xml version="1.0" encoding="utf-8"?>
-<w:numbering xmlns:wpc="http://schemas.microsoft.com/office/word/2010/wordprocessingCanvas" xmlns:cx="http://schemas.microsoft.com/office/drawing/2014/chartex" xmlns:cx1="http://schemas.microsoft.com/office/drawing/2015/9/8/chartex" xmlns:cx2="http://schemas.microsoft.com/office/drawing/2015/10/21/chartex" xmlns:cx3="http://schemas.microsoft.com/office/drawing/2016/5/9/chartex" xmlns:cx4="http://schemas.microsoft.com/office/drawing/2016/5/10/chartex" xmlns:cx5="http://schemas.microsoft.com/office/drawing/2016/5/11/chartex" xmlns:cx6="http://schemas.microsoft.com/office/drawing/2016/5/12/chartex" xmlns:cx7="http://schemas.microsoft.com/office/drawing/2016/5/13/chartex" xmlns:cx8="http://schemas.microsoft.com/office/drawing/2016/5/14/chartex" xmlns:mc="http://schemas.openxmlformats.org/markup-compatibility/2006" xmlns:m="http://schemas.openxmlformats.org/officeDocument/2006/math" xmlns:aink="http://schemas.microsoft.com/office/drawing/2016/ink" xmlns:am3d="http://schemas.microsoft.com/office/drawing/2017/model3d" xmlns:oel="http://schemas.microsoft.com/office/2019/extlst" xmlns:r="http://schemas.openxmlformats.org/officeDocument/2006/relationships" xmlns:wp14="http://schemas.microsoft.com/office/word/2010/wordprocessingDrawing" xmlns:wp="http://schemas.openxmlformats.org/drawingml/2006/wordprocessingDrawing" xmlns:wpg="http://schemas.microsoft.com/office/word/2010/wordprocessingGroup" xmlns:wpi="http://schemas.microsoft.com/office/word/2010/wordprocessingInk" xmlns:wps="http://schemas.microsoft.com/office/word/2010/wordprocessingShape" xmlns:o="urn:schemas-microsoft-com:office:office" xmlns:v="urn:schemas-microsoft-com:vml" xmlns:w10="urn:schemas-microsoft-com:office:word" xmlns:w="http://schemas.openxmlformats.org/wordprocessingml/2006/main" xmlns:w14="http://schemas.microsoft.com/office/word/2010/wordml" xmlns:w15="http://schemas.microsoft.com/office/word/2012/wordml" xmlns:w16cex="http://schemas.microsoft.com/office/word/2018/wordml/cex" xmlns:w16cid="http://schemas.microsoft.com/office/word/2016/wordml/cid" xmlns:w16="http://schemas.microsoft.com/office/word/2018/wordml" xmlns:w16sdtdh="http://schemas.microsoft.com/office/word/2020/wordml/sdtdatahash" xmlns:w16sdtfl="http://schemas.microsoft.com/office/word/2024/wordml/sdtformatlock" xmlns:w16se="http://schemas.microsoft.com/office/word/2015/wordml/symex" xmlns:w16du="http://schemas.microsoft.com/office/word/2023/wordml/word16du" xmlns:wne="http://schemas.microsoft.com/office/word/2006/wordml" mc:Ignorable="w14 w15 w16se w16cid w16 w16cex w16sdtdh w16sdtfl w16du wp14">
+<w:numbering xmlns:wpc="http://schemas.microsoft.com/office/word/2010/wordprocessingCanvas" xmlns:cx="http://schemas.microsoft.com/office/drawing/2014/chartex" xmlns:cx1="http://schemas.microsoft.com/office/drawing/2015/9/8/chartex" xmlns:cx2="http://schemas.microsoft.com/office/drawing/2015/10/21/chartex" xmlns:cx3="http://schemas.microsoft.com/office/drawing/2016/5/9/chartex" xmlns:cx4="http://schemas.microsoft.com/office/drawing/2016/5/10/chartex" xmlns:cx5="http://schemas.microsoft.com/office/drawing/2016/5/11/chartex" xmlns:cx6="http://schemas.microsoft.com/office/drawing/2016/5/12/chartex" xmlns:cx7="http://schemas.microsoft.com/office/drawing/2016/5/13/chartex" xmlns:cx8="http://schemas.microsoft.com/office/drawing/2016/5/14/chartex" xmlns:mc="http://schemas.openxmlformats.org/markup-compatibility/2006" xmlns:m="http://schemas.openxmlformats.org/officeDocument/2006/math" xmlns:aink="http://schemas.microsoft.com/office/drawing/2016/ink" xmlns:am3d="http://schemas.microsoft.com/office/drawing/2017/model3d" xmlns:oel="http://schemas.microsoft.com/office/2019/extlst" xmlns:r="http://schemas.openxmlformats.org/officeDocument/2006/relationships" xmlns:wp14="http://schemas.microsoft.com/office/word/2010/wordprocessingDrawing" xmlns:wp="http://schemas.openxmlformats.org/drawingml/2006/wordprocessingDrawing" xmlns:wpg="http://schemas.microsoft.com/office/word/2010/wordprocessingGroup" xmlns:wpi="http://schemas.microsoft.com/office/word/2010/wordprocessingInk" xmlns:wps="http://schemas.microsoft.com/office/word/2010/wordprocessingShape" xmlns:o="urn:schemas-microsoft-com:office:office" xmlns:v="urn:schemas-microsoft-com:vml" xmlns:w10="urn:schemas-microsoft-com:office:word" xmlns:w="http://schemas.openxmlformats.org/wordprocessingml/2006/main" xmlns:w14="http://schemas.microsoft.com/office/word/2010/wordml" xmlns:w15="http://schemas.microsoft.com/office/word/2012/wordml" xmlns:w16cei="http://schemas.microsoft.com/office/word/2026/wordml/cei" xmlns:w16cex="http://schemas.microsoft.com/office/word/2018/wordml/cex" xmlns:w16cid="http://schemas.microsoft.com/office/word/2016/wordml/cid" xmlns:w16="http://schemas.microsoft.com/office/word/2018/wordml" xmlns:w16sdtdh="http://schemas.microsoft.com/office/word/2020/wordml/sdtdatahash" xmlns:w16sdtfl="http://schemas.microsoft.com/office/word/2024/wordml/sdtformatlock" xmlns:w16se="http://schemas.microsoft.com/office/word/2015/wordml/symex" xmlns:w16du="http://schemas.microsoft.com/office/word/2023/wordml/word16du" xmlns:wne="http://schemas.microsoft.com/office/word/2006/wordml" mc:Ignorable="w14 w15 w16se w16cid w16 w16cex w16sdtdh w16sdtfl w16du wp14">
   <w:abstractNum w:abstractNumId="0" w15:restartNumberingAfterBreak="0">
+    <w:nsid w:val="0F8767C3"/>
+    <w:multiLevelType w:val="hybridMultilevel"/>
+    <w:tmpl w:val="DCD0D892"/>
+    <w:lvl w:ilvl="0" w:tplc="08090001">
+      <w:start w:val="1"/>
+      <w:numFmt w:val="bullet"/>
+      <w:lvlText w:val=""/>
+      <w:lvlJc w:val="left"/>
+      <w:pPr>
+        <w:ind w:left="720" w:hanging="360"/>
+      </w:pPr>
+      <w:rPr>
+        <w:rFonts w:ascii="Symbol" w:hAnsi="Symbol" w:hint="default"/>
+      </w:rPr>
+    </w:lvl>
+    <w:lvl w:ilvl="1" w:tplc="08090003">
+      <w:start w:val="1"/>
+      <w:numFmt w:val="bullet"/>
+      <w:lvlText w:val="o"/>
+      <w:lvlJc w:val="left"/>
+      <w:pPr>
+        <w:ind w:left="1440" w:hanging="360"/>
+      </w:pPr>
+      <w:rPr>
+        <w:rFonts w:ascii="Courier New" w:hAnsi="Courier New" w:cs="Courier New" w:hint="default"/>
+      </w:rPr>
+    </w:lvl>
+    <w:lvl w:ilvl="2" w:tplc="08090005" w:tentative="1">
+      <w:start w:val="1"/>
+      <w:numFmt w:val="bullet"/>
+      <w:lvlText w:val=""/>
+      <w:lvlJc w:val="left"/>
+      <w:pPr>
+        <w:ind w:left="2160" w:hanging="360"/>
+      </w:pPr>
+      <w:rPr>
+        <w:rFonts w:ascii="Wingdings" w:hAnsi="Wingdings" w:hint="default"/>
+      </w:rPr>
+    </w:lvl>
+    <w:lvl w:ilvl="3" w:tplc="08090001" w:tentative="1">
+      <w:start w:val="1"/>
+      <w:numFmt w:val="bullet"/>
+      <w:lvlText w:val=""/>
+      <w:lvlJc w:val="left"/>
+      <w:pPr>
+        <w:ind w:left="2880" w:hanging="360"/>
+      </w:pPr>
+      <w:rPr>
+        <w:rFonts w:ascii="Symbol" w:hAnsi="Symbol" w:hint="default"/>
+      </w:rPr>
+    </w:lvl>
+    <w:lvl w:ilvl="4" w:tplc="08090003" w:tentative="1">
+      <w:start w:val="1"/>
+      <w:numFmt w:val="bullet"/>
+      <w:lvlText w:val="o"/>
+      <w:lvlJc w:val="left"/>
+      <w:pPr>
+        <w:ind w:left="3600" w:hanging="360"/>
+      </w:pPr>
+      <w:rPr>
+        <w:rFonts w:ascii="Courier New" w:hAnsi="Courier New" w:cs="Courier New" w:hint="default"/>
+      </w:rPr>
+    </w:lvl>
+    <w:lvl w:ilvl="5" w:tplc="08090005" w:tentative="1">
+      <w:start w:val="1"/>
+      <w:numFmt w:val="bullet"/>
+      <w:lvlText w:val=""/>
+      <w:lvlJc w:val="left"/>
+      <w:pPr>
+        <w:ind w:left="4320" w:hanging="360"/>
+      </w:pPr>
+      <w:rPr>
+        <w:rFonts w:ascii="Wingdings" w:hAnsi="Wingdings" w:hint="default"/>
+      </w:rPr>
+    </w:lvl>
+    <w:lvl w:ilvl="6" w:tplc="08090001" w:tentative="1">
+      <w:start w:val="1"/>
+      <w:numFmt w:val="bullet"/>
+      <w:lvlText w:val=""/>
+      <w:lvlJc w:val="left"/>
+      <w:pPr>
+        <w:ind w:left="5040" w:hanging="360"/>
+      </w:pPr>
+      <w:rPr>
+        <w:rFonts w:ascii="Symbol" w:hAnsi="Symbol" w:hint="default"/>
+      </w:rPr>
+    </w:lvl>
+    <w:lvl w:ilvl="7" w:tplc="08090003" w:tentative="1">
+      <w:start w:val="1"/>
+      <w:numFmt w:val="bullet"/>
+      <w:lvlText w:val="o"/>
+      <w:lvlJc w:val="left"/>
+      <w:pPr>
+        <w:ind w:left="5760" w:hanging="360"/>
+      </w:pPr>
+      <w:rPr>
+        <w:rFonts w:ascii="Courier New" w:hAnsi="Courier New" w:cs="Courier New" w:hint="default"/>
+      </w:rPr>
+    </w:lvl>
+    <w:lvl w:ilvl="8" w:tplc="08090005" w:tentative="1">
+      <w:start w:val="1"/>
+      <w:numFmt w:val="bullet"/>
+      <w:lvlText w:val=""/>
+      <w:lvlJc w:val="left"/>
+      <w:pPr>
+        <w:ind w:left="6480" w:hanging="360"/>
+      </w:pPr>
+      <w:rPr>
+        <w:rFonts w:ascii="Wingdings" w:hAnsi="Wingdings" w:hint="default"/>
+      </w:rPr>
+    </w:lvl>
+  </w:abstractNum>
+  <w:abstractNum w:abstractNumId="1" w15:restartNumberingAfterBreak="0">
     <w:nsid w:val="2A1221BB"/>
     <w:multiLevelType w:val="hybridMultilevel"/>
     <w:tmpl w:val="7E0CF6CC"/>
@@ -270,7 +433,7 @@
       </w:rPr>
     </w:lvl>
   </w:abstractNum>
-  <w:abstractNum w:abstractNumId="1" w15:restartNumberingAfterBreak="0">
+  <w:abstractNum w:abstractNumId="2" w15:restartNumberingAfterBreak="0">
     <w:nsid w:val="692B5E95"/>
     <w:multiLevelType w:val="hybridMultilevel"/>
     <w:tmpl w:val="6AD03B7C"/>
@@ -286,7 +449,7 @@
         <w:rFonts w:ascii="Symbol" w:hAnsi="Symbol" w:hint="default"/>
       </w:rPr>
     </w:lvl>
-    <w:lvl w:ilvl="1" w:tplc="08090003" w:tentative="1">
+    <w:lvl w:ilvl="1" w:tplc="08090003">
       <w:start w:val="1"/>
       <w:numFmt w:val="bullet"/>
       <w:lvlText w:val="o"/>
@@ -383,7 +546,7 @@
       </w:rPr>
     </w:lvl>
   </w:abstractNum>
-  <w:abstractNum w:abstractNumId="2" w15:restartNumberingAfterBreak="0">
+  <w:abstractNum w:abstractNumId="3" w15:restartNumberingAfterBreak="0">
     <w:nsid w:val="746A5C0A"/>
     <w:multiLevelType w:val="hybridMultilevel"/>
     <w:tmpl w:val="50DEA51A"/>
@@ -497,13 +660,16 @@
     </w:lvl>
   </w:abstractNum>
   <w:num w:numId="1" w16cid:durableId="853226515">
+    <w:abstractNumId w:val="3"/>
+  </w:num>
+  <w:num w:numId="2" w16cid:durableId="1597787845">
+    <w:abstractNumId w:val="1"/>
+  </w:num>
+  <w:num w:numId="3" w16cid:durableId="1477526337">
     <w:abstractNumId w:val="2"/>
   </w:num>
-  <w:num w:numId="2" w16cid:durableId="1597787845">
+  <w:num w:numId="4" w16cid:durableId="2027368701">
     <w:abstractNumId w:val="0"/>
-  </w:num>
-  <w:num w:numId="3" w16cid:durableId="1477526337">
-    <w:abstractNumId w:val="1"/>
   </w:num>
 </w:numbering>
 </file>

</xml_diff>

<commit_message>
ADDING TODAY'S WORK - 16.07.2026
</commit_message>
<xml_diff>
--- a/github/drafts/github_plan.docx
+++ b/github/drafts/github_plan.docx
@@ -19,15 +19,7 @@
         <w:ind w:left="720" w:hanging="360"/>
       </w:pPr>
       <w:r>
-        <w:t xml:space="preserve">N.B. </w:t>
-      </w:r>
-      <w:proofErr w:type="spellStart"/>
-      <w:r>
-        <w:t>github</w:t>
-      </w:r>
-      <w:proofErr w:type="spellEnd"/>
-      <w:r>
-        <w:t xml:space="preserve"> won’t be marked like it was in the group projects – it just needs to be reproducible, not incredibly flashy or with lengthy descriptions</w:t>
+        <w:t>N.B. github won’t be marked like it was in the group projects – it just needs to be reproducible, not incredibly flashy or with lengthy descriptions</w:t>
       </w:r>
       <w:r>
         <w:t>.</w:t>
@@ -42,15 +34,7 @@
         </w:numPr>
       </w:pPr>
       <w:r>
-        <w:t xml:space="preserve">Add template script to </w:t>
-      </w:r>
-      <w:proofErr w:type="spellStart"/>
-      <w:r>
-        <w:t>github</w:t>
-      </w:r>
-      <w:proofErr w:type="spellEnd"/>
-      <w:r>
-        <w:t xml:space="preserve"> because this is referenced in my methods and they need to see how it looks without any script-specific info in</w:t>
+        <w:t>Add template script to github because this is referenced in my methods and they need to see how it looks without any script-specific info in</w:t>
       </w:r>
     </w:p>
     <w:p>
@@ -62,15 +46,7 @@
         </w:numPr>
       </w:pPr>
       <w:r>
-        <w:t xml:space="preserve">Can use </w:t>
-      </w:r>
-      <w:proofErr w:type="spellStart"/>
-      <w:r>
-        <w:t>mkdocs</w:t>
-      </w:r>
-      <w:proofErr w:type="spellEnd"/>
-      <w:r>
-        <w:t xml:space="preserve"> if I want to provide the level of detail I did in the coursework – matt said this is better than putting the info in the repo which just clutters it up</w:t>
+        <w:t>Can use mkdocs if I want to provide the level of detail I did in the coursework – matt said this is better than putting the info in the repo which just clutters it up</w:t>
       </w:r>
     </w:p>
     <w:p>
@@ -93,21 +69,11 @@
           <w:numId w:val="3"/>
         </w:numPr>
       </w:pPr>
-      <w:proofErr w:type="spellStart"/>
       <w:r>
         <w:t>Snakemake</w:t>
       </w:r>
-      <w:proofErr w:type="spellEnd"/>
       <w:r>
-        <w:t>/</w:t>
-      </w:r>
-      <w:proofErr w:type="spellStart"/>
-      <w:r>
-        <w:t>nextflow</w:t>
-      </w:r>
-      <w:proofErr w:type="spellEnd"/>
-      <w:r>
-        <w:t xml:space="preserve"> </w:t>
+        <w:t xml:space="preserve">/nextflow </w:t>
       </w:r>
       <w:r>
         <w:t>would be nice but not essential</w:t>
@@ -134,15 +100,7 @@
         </w:numPr>
       </w:pPr>
       <w:r>
-        <w:t>Need to change 04_map_reads to ‘</w:t>
-      </w:r>
-      <w:proofErr w:type="spellStart"/>
-      <w:r>
-        <w:t>collapse_reads</w:t>
-      </w:r>
-      <w:proofErr w:type="spellEnd"/>
-      <w:r>
-        <w:t>’. Alternatively, combine script 04 and 05 – this would align nicely with the methods section</w:t>
+        <w:t>Need to change 04_map_reads to ‘collapse_reads’. Alternatively, combine script 04 and 05 – this would align nicely with the methods section</w:t>
       </w:r>
     </w:p>
     <w:p>
@@ -194,6 +152,33 @@
           <w:numId w:val="3"/>
         </w:numPr>
       </w:pPr>
+      <w:r>
+        <w:t xml:space="preserve">Have a folder called ‘test_data’ and put the subsets in there. The initial script can pull the data from there using `ls` and wildcards </w:t>
+      </w:r>
+    </w:p>
+    <w:p>
+      <w:pPr>
+        <w:pStyle w:val="ListParagraph"/>
+        <w:numPr>
+          <w:ilvl w:val="0"/>
+          <w:numId w:val="3"/>
+        </w:numPr>
+      </w:pPr>
+      <w:r>
+        <w:t>Can add supplementary data e.g., excel files with large tables and multiqc report to github.</w:t>
+      </w:r>
+    </w:p>
+    <w:p>
+      <w:pPr>
+        <w:pStyle w:val="ListParagraph"/>
+        <w:numPr>
+          <w:ilvl w:val="0"/>
+          <w:numId w:val="3"/>
+        </w:numPr>
+      </w:pPr>
+      <w:r>
+        <w:t>Need to add the multiqc report for 01_protease and 02_hdm_dog as supplementary</w:t>
+      </w:r>
     </w:p>
     <w:sectPr>
       <w:pgSz w:w="11906" w:h="16838"/>

</xml_diff>

<commit_message>
ADDING TODAY'S WORK - 18.07.2026
</commit_message>
<xml_diff>
--- a/github/drafts/github_plan.docx
+++ b/github/drafts/github_plan.docx
@@ -19,7 +19,15 @@
         <w:ind w:left="720" w:hanging="360"/>
       </w:pPr>
       <w:r>
-        <w:t>N.B. github won’t be marked like it was in the group projects – it just needs to be reproducible, not incredibly flashy or with lengthy descriptions</w:t>
+        <w:t xml:space="preserve">N.B. </w:t>
+      </w:r>
+      <w:proofErr w:type="spellStart"/>
+      <w:r>
+        <w:t>github</w:t>
+      </w:r>
+      <w:proofErr w:type="spellEnd"/>
+      <w:r>
+        <w:t xml:space="preserve"> won’t be marked like it was in the group projects – it just needs to be reproducible, not incredibly flashy or with lengthy descriptions</w:t>
       </w:r>
       <w:r>
         <w:t>.</w:t>
@@ -34,7 +42,15 @@
         </w:numPr>
       </w:pPr>
       <w:r>
-        <w:t>Add template script to github because this is referenced in my methods and they need to see how it looks without any script-specific info in</w:t>
+        <w:t xml:space="preserve">Add template script to </w:t>
+      </w:r>
+      <w:proofErr w:type="spellStart"/>
+      <w:r>
+        <w:t>github</w:t>
+      </w:r>
+      <w:proofErr w:type="spellEnd"/>
+      <w:r>
+        <w:t xml:space="preserve"> because this is referenced in my methods and they need to see how it looks without any script-specific info in</w:t>
       </w:r>
     </w:p>
     <w:p>
@@ -46,7 +62,15 @@
         </w:numPr>
       </w:pPr>
       <w:r>
-        <w:t>Can use mkdocs if I want to provide the level of detail I did in the coursework – matt said this is better than putting the info in the repo which just clutters it up</w:t>
+        <w:t xml:space="preserve">Can use </w:t>
+      </w:r>
+      <w:proofErr w:type="spellStart"/>
+      <w:r>
+        <w:t>mkdocs</w:t>
+      </w:r>
+      <w:proofErr w:type="spellEnd"/>
+      <w:r>
+        <w:t xml:space="preserve"> if I want to provide the level of detail I did in the coursework – matt said this is better than putting the info in the repo which just clutters it up</w:t>
       </w:r>
     </w:p>
     <w:p>
@@ -69,11 +93,21 @@
           <w:numId w:val="3"/>
         </w:numPr>
       </w:pPr>
+      <w:proofErr w:type="spellStart"/>
       <w:r>
         <w:t>Snakemake</w:t>
       </w:r>
-      <w:r>
-        <w:t xml:space="preserve">/nextflow </w:t>
+      <w:proofErr w:type="spellEnd"/>
+      <w:r>
+        <w:t>/</w:t>
+      </w:r>
+      <w:proofErr w:type="spellStart"/>
+      <w:r>
+        <w:t>nextflow</w:t>
+      </w:r>
+      <w:proofErr w:type="spellEnd"/>
+      <w:r>
+        <w:t xml:space="preserve"> </w:t>
       </w:r>
       <w:r>
         <w:t>would be nice but not essential</w:t>
@@ -100,7 +134,15 @@
         </w:numPr>
       </w:pPr>
       <w:r>
-        <w:t>Need to change 04_map_reads to ‘collapse_reads’. Alternatively, combine script 04 and 05 – this would align nicely with the methods section</w:t>
+        <w:t>Need to change 04_map_reads to ‘</w:t>
+      </w:r>
+      <w:proofErr w:type="spellStart"/>
+      <w:r>
+        <w:t>collapse_reads</w:t>
+      </w:r>
+      <w:proofErr w:type="spellEnd"/>
+      <w:r>
+        <w:t>’. Alternatively, combine script 04 and 05 – this would align nicely with the methods section</w:t>
       </w:r>
     </w:p>
     <w:p>
@@ -153,7 +195,27 @@
         </w:numPr>
       </w:pPr>
       <w:r>
-        <w:t xml:space="preserve">Have a folder called ‘test_data’ and put the subsets in there. The initial script can pull the data from there using `ls` and wildcards </w:t>
+        <w:t>Have a folder called ‘</w:t>
+      </w:r>
+      <w:r>
+        <w:t>01_Protease_</w:t>
+      </w:r>
+      <w:r>
+        <w:t xml:space="preserve">test_data’ </w:t>
+      </w:r>
+      <w:r>
+        <w:t xml:space="preserve">and ‘02_HDM_Dog_test_data’ </w:t>
+      </w:r>
+      <w:r>
+        <w:t>and put the subsets in there. The initial script can pull the data from there using `</w:t>
+      </w:r>
+      <w:proofErr w:type="spellStart"/>
+      <w:r>
+        <w:t>ls`</w:t>
+      </w:r>
+      <w:proofErr w:type="spellEnd"/>
+      <w:r>
+        <w:t xml:space="preserve"> and wildcards </w:t>
       </w:r>
     </w:p>
     <w:p>
@@ -165,7 +227,23 @@
         </w:numPr>
       </w:pPr>
       <w:r>
-        <w:t>Can add supplementary data e.g., excel files with large tables and multiqc report to github.</w:t>
+        <w:t xml:space="preserve">Can add supplementary data e.g., excel files with large tables and </w:t>
+      </w:r>
+      <w:proofErr w:type="spellStart"/>
+      <w:r>
+        <w:t>multiqc</w:t>
+      </w:r>
+      <w:proofErr w:type="spellEnd"/>
+      <w:r>
+        <w:t xml:space="preserve"> report to </w:t>
+      </w:r>
+      <w:proofErr w:type="spellStart"/>
+      <w:r>
+        <w:t>github</w:t>
+      </w:r>
+      <w:proofErr w:type="spellEnd"/>
+      <w:r>
+        <w:t>.</w:t>
       </w:r>
     </w:p>
     <w:p>
@@ -177,7 +255,15 @@
         </w:numPr>
       </w:pPr>
       <w:r>
-        <w:t>Need to add the multiqc report for 01_protease and 02_hdm_dog as supplementary</w:t>
+        <w:t xml:space="preserve">Need to add the </w:t>
+      </w:r>
+      <w:proofErr w:type="spellStart"/>
+      <w:r>
+        <w:t>multiqc</w:t>
+      </w:r>
+      <w:proofErr w:type="spellEnd"/>
+      <w:r>
+        <w:t xml:space="preserve"> report for 01_protease and 02_hdm_dog as supplementary</w:t>
       </w:r>
     </w:p>
     <w:sectPr>

</xml_diff>

<commit_message>
ADDING TODAY'S WORK - 29.07.2026
</commit_message>
<xml_diff>
--- a/github/drafts/github_plan.docx
+++ b/github/drafts/github_plan.docx
@@ -265,6 +265,539 @@
       <w:r>
         <w:t xml:space="preserve"> report for 01_protease and 02_hdm_dog as supplementary</w:t>
       </w:r>
+    </w:p>
+    <w:p>
+      <w:r>
+        <w:t>Environments:</w:t>
+      </w:r>
+    </w:p>
+    <w:p>
+      <w:r>
+        <w:t>L4137_R_analysis</w:t>
+      </w:r>
+      <w:r>
+        <w:t>:</w:t>
+      </w:r>
+    </w:p>
+    <w:p>
+      <w:pPr>
+        <w:pStyle w:val="ListParagraph"/>
+        <w:numPr>
+          <w:ilvl w:val="0"/>
+          <w:numId w:val="6"/>
+        </w:numPr>
+      </w:pPr>
+      <w:r>
+        <w:t xml:space="preserve">    - </w:t>
+      </w:r>
+      <w:proofErr w:type="spellStart"/>
+      <w:r>
+        <w:t>bioconductor-clusterprofiler</w:t>
+      </w:r>
+      <w:proofErr w:type="spellEnd"/>
+    </w:p>
+    <w:p>
+      <w:pPr>
+        <w:pStyle w:val="ListParagraph"/>
+        <w:numPr>
+          <w:ilvl w:val="0"/>
+          <w:numId w:val="6"/>
+        </w:numPr>
+      </w:pPr>
+      <w:r>
+        <w:t xml:space="preserve">    - </w:t>
+      </w:r>
+      <w:proofErr w:type="spellStart"/>
+      <w:r>
+        <w:t>bioconductor</w:t>
+      </w:r>
+      <w:proofErr w:type="spellEnd"/>
+      <w:r>
+        <w:t>-edger</w:t>
+      </w:r>
+    </w:p>
+    <w:p>
+      <w:pPr>
+        <w:pStyle w:val="ListParagraph"/>
+        <w:numPr>
+          <w:ilvl w:val="0"/>
+          <w:numId w:val="6"/>
+        </w:numPr>
+      </w:pPr>
+      <w:r>
+        <w:t xml:space="preserve">    - </w:t>
+      </w:r>
+      <w:proofErr w:type="spellStart"/>
+      <w:r>
+        <w:t>bioconductor-multimir</w:t>
+      </w:r>
+      <w:proofErr w:type="spellEnd"/>
+    </w:p>
+    <w:p>
+      <w:pPr>
+        <w:pStyle w:val="ListParagraph"/>
+        <w:numPr>
+          <w:ilvl w:val="0"/>
+          <w:numId w:val="6"/>
+        </w:numPr>
+      </w:pPr>
+      <w:r>
+        <w:t xml:space="preserve">    - </w:t>
+      </w:r>
+      <w:proofErr w:type="spellStart"/>
+      <w:r>
+        <w:t>bioconductor-org.hs.eg.db</w:t>
+      </w:r>
+      <w:proofErr w:type="spellEnd"/>
+    </w:p>
+    <w:p>
+      <w:pPr>
+        <w:pStyle w:val="ListParagraph"/>
+        <w:numPr>
+          <w:ilvl w:val="0"/>
+          <w:numId w:val="6"/>
+        </w:numPr>
+      </w:pPr>
+      <w:r>
+        <w:t xml:space="preserve">    - </w:t>
+      </w:r>
+      <w:proofErr w:type="spellStart"/>
+      <w:r>
+        <w:t>bioconductor-reactomepa</w:t>
+      </w:r>
+      <w:proofErr w:type="spellEnd"/>
+    </w:p>
+    <w:p>
+      <w:pPr>
+        <w:pStyle w:val="ListParagraph"/>
+        <w:numPr>
+          <w:ilvl w:val="0"/>
+          <w:numId w:val="6"/>
+        </w:numPr>
+      </w:pPr>
+      <w:r>
+        <w:t xml:space="preserve">    - r-base</w:t>
+      </w:r>
+    </w:p>
+    <w:p>
+      <w:pPr>
+        <w:pStyle w:val="ListParagraph"/>
+        <w:numPr>
+          <w:ilvl w:val="0"/>
+          <w:numId w:val="6"/>
+        </w:numPr>
+      </w:pPr>
+      <w:r>
+        <w:t xml:space="preserve">    - r-</w:t>
+      </w:r>
+      <w:proofErr w:type="spellStart"/>
+      <w:r>
+        <w:t>dplyr</w:t>
+      </w:r>
+      <w:proofErr w:type="spellEnd"/>
+    </w:p>
+    <w:p>
+      <w:pPr>
+        <w:pStyle w:val="ListParagraph"/>
+        <w:numPr>
+          <w:ilvl w:val="0"/>
+          <w:numId w:val="6"/>
+        </w:numPr>
+      </w:pPr>
+      <w:r>
+        <w:t xml:space="preserve">    - r-ggplot2</w:t>
+      </w:r>
+    </w:p>
+    <w:p>
+      <w:pPr>
+        <w:pStyle w:val="ListParagraph"/>
+        <w:numPr>
+          <w:ilvl w:val="0"/>
+          <w:numId w:val="6"/>
+        </w:numPr>
+      </w:pPr>
+      <w:r>
+        <w:lastRenderedPageBreak/>
+        <w:t xml:space="preserve">    - r-</w:t>
+      </w:r>
+      <w:proofErr w:type="spellStart"/>
+      <w:r>
+        <w:t>ggplotify</w:t>
+      </w:r>
+      <w:proofErr w:type="spellEnd"/>
+    </w:p>
+    <w:p>
+      <w:pPr>
+        <w:pStyle w:val="ListParagraph"/>
+        <w:numPr>
+          <w:ilvl w:val="0"/>
+          <w:numId w:val="6"/>
+        </w:numPr>
+      </w:pPr>
+      <w:r>
+        <w:t xml:space="preserve">    - r-</w:t>
+      </w:r>
+      <w:proofErr w:type="spellStart"/>
+      <w:r>
+        <w:t>ggpubr</w:t>
+      </w:r>
+      <w:proofErr w:type="spellEnd"/>
+    </w:p>
+    <w:p>
+      <w:pPr>
+        <w:pStyle w:val="ListParagraph"/>
+        <w:numPr>
+          <w:ilvl w:val="0"/>
+          <w:numId w:val="6"/>
+        </w:numPr>
+      </w:pPr>
+      <w:r>
+        <w:t xml:space="preserve">    - r-</w:t>
+      </w:r>
+      <w:proofErr w:type="spellStart"/>
+      <w:r>
+        <w:t>ggrepel</w:t>
+      </w:r>
+      <w:proofErr w:type="spellEnd"/>
+    </w:p>
+    <w:p>
+      <w:pPr>
+        <w:pStyle w:val="ListParagraph"/>
+        <w:numPr>
+          <w:ilvl w:val="0"/>
+          <w:numId w:val="6"/>
+        </w:numPr>
+      </w:pPr>
+      <w:r>
+        <w:t xml:space="preserve">    - r-patchwork</w:t>
+      </w:r>
+    </w:p>
+    <w:p>
+      <w:pPr>
+        <w:pStyle w:val="ListParagraph"/>
+        <w:numPr>
+          <w:ilvl w:val="0"/>
+          <w:numId w:val="6"/>
+        </w:numPr>
+      </w:pPr>
+      <w:r>
+        <w:t xml:space="preserve">    - r-</w:t>
+      </w:r>
+      <w:proofErr w:type="spellStart"/>
+      <w:r>
+        <w:t>pheatmap</w:t>
+      </w:r>
+      <w:proofErr w:type="spellEnd"/>
+    </w:p>
+    <w:p>
+      <w:pPr>
+        <w:pStyle w:val="ListParagraph"/>
+        <w:numPr>
+          <w:ilvl w:val="0"/>
+          <w:numId w:val="6"/>
+        </w:numPr>
+      </w:pPr>
+      <w:r>
+        <w:t xml:space="preserve">    - r-</w:t>
+      </w:r>
+      <w:proofErr w:type="spellStart"/>
+      <w:r>
+        <w:t>rcolorbrewer</w:t>
+      </w:r>
+      <w:proofErr w:type="spellEnd"/>
+    </w:p>
+    <w:p>
+      <w:pPr>
+        <w:pStyle w:val="ListParagraph"/>
+        <w:numPr>
+          <w:ilvl w:val="0"/>
+          <w:numId w:val="6"/>
+        </w:numPr>
+      </w:pPr>
+      <w:r>
+        <w:t xml:space="preserve">    - r-</w:t>
+      </w:r>
+      <w:proofErr w:type="spellStart"/>
+      <w:r>
+        <w:t>readr</w:t>
+      </w:r>
+      <w:proofErr w:type="spellEnd"/>
+    </w:p>
+    <w:p>
+      <w:pPr>
+        <w:pStyle w:val="ListParagraph"/>
+        <w:numPr>
+          <w:ilvl w:val="0"/>
+          <w:numId w:val="6"/>
+        </w:numPr>
+      </w:pPr>
+      <w:r>
+        <w:t xml:space="preserve">    - r-scales</w:t>
+      </w:r>
+    </w:p>
+    <w:p>
+      <w:pPr>
+        <w:pStyle w:val="ListParagraph"/>
+        <w:numPr>
+          <w:ilvl w:val="0"/>
+          <w:numId w:val="6"/>
+        </w:numPr>
+      </w:pPr>
+      <w:r>
+        <w:t xml:space="preserve">    - r-</w:t>
+      </w:r>
+      <w:proofErr w:type="spellStart"/>
+      <w:r>
+        <w:t>stringr</w:t>
+      </w:r>
+      <w:proofErr w:type="spellEnd"/>
+    </w:p>
+    <w:p>
+      <w:pPr>
+        <w:pStyle w:val="ListParagraph"/>
+        <w:numPr>
+          <w:ilvl w:val="0"/>
+          <w:numId w:val="6"/>
+        </w:numPr>
+      </w:pPr>
+      <w:r>
+        <w:t xml:space="preserve">    - r-</w:t>
+      </w:r>
+      <w:proofErr w:type="spellStart"/>
+      <w:r>
+        <w:t>tidyr</w:t>
+      </w:r>
+      <w:proofErr w:type="spellEnd"/>
+    </w:p>
+    <w:p>
+      <w:pPr>
+        <w:pStyle w:val="ListParagraph"/>
+        <w:numPr>
+          <w:ilvl w:val="0"/>
+          <w:numId w:val="6"/>
+        </w:numPr>
+      </w:pPr>
+      <w:r>
+        <w:t xml:space="preserve">    - r-</w:t>
+      </w:r>
+      <w:proofErr w:type="spellStart"/>
+      <w:r>
+        <w:t>viridis</w:t>
+      </w:r>
+      <w:proofErr w:type="spellEnd"/>
+    </w:p>
+    <w:p>
+      <w:r>
+        <w:t>File structure:</w:t>
+      </w:r>
+    </w:p>
+    <w:p>
+      <w:pPr>
+        <w:pStyle w:val="ListParagraph"/>
+        <w:numPr>
+          <w:ilvl w:val="0"/>
+          <w:numId w:val="5"/>
+        </w:numPr>
+      </w:pPr>
+      <w:r>
+        <w:t>environments</w:t>
+      </w:r>
+    </w:p>
+    <w:p>
+      <w:pPr>
+        <w:pStyle w:val="ListParagraph"/>
+        <w:numPr>
+          <w:ilvl w:val="0"/>
+          <w:numId w:val="5"/>
+        </w:numPr>
+      </w:pPr>
+      <w:proofErr w:type="spellStart"/>
+      <w:r>
+        <w:t>test_data</w:t>
+      </w:r>
+      <w:proofErr w:type="spellEnd"/>
+    </w:p>
+    <w:p>
+      <w:pPr>
+        <w:pStyle w:val="ListParagraph"/>
+        <w:numPr>
+          <w:ilvl w:val="1"/>
+          <w:numId w:val="5"/>
+        </w:numPr>
+      </w:pPr>
+      <w:proofErr w:type="spellStart"/>
+      <w:r>
+        <w:t>primaryHBEC</w:t>
+      </w:r>
+      <w:proofErr w:type="spellEnd"/>
+    </w:p>
+    <w:p>
+      <w:pPr>
+        <w:pStyle w:val="ListParagraph"/>
+        <w:numPr>
+          <w:ilvl w:val="1"/>
+          <w:numId w:val="5"/>
+        </w:numPr>
+      </w:pPr>
+      <w:r>
+        <w:t>calu3</w:t>
+      </w:r>
+    </w:p>
+    <w:p>
+      <w:pPr>
+        <w:pStyle w:val="ListParagraph"/>
+        <w:numPr>
+          <w:ilvl w:val="0"/>
+          <w:numId w:val="5"/>
+        </w:numPr>
+      </w:pPr>
+      <w:r>
+        <w:t>scripts</w:t>
+      </w:r>
+    </w:p>
+    <w:p>
+      <w:pPr>
+        <w:pStyle w:val="ListParagraph"/>
+        <w:numPr>
+          <w:ilvl w:val="1"/>
+          <w:numId w:val="5"/>
+        </w:numPr>
+      </w:pPr>
+      <w:r>
+        <w:t>workflow</w:t>
+      </w:r>
+    </w:p>
+    <w:p>
+      <w:pPr>
+        <w:pStyle w:val="ListParagraph"/>
+        <w:numPr>
+          <w:ilvl w:val="2"/>
+          <w:numId w:val="5"/>
+        </w:numPr>
+      </w:pPr>
+      <w:proofErr w:type="spellStart"/>
+      <w:r>
+        <w:t>primaryHBEC</w:t>
+      </w:r>
+      <w:proofErr w:type="spellEnd"/>
+    </w:p>
+    <w:p>
+      <w:pPr>
+        <w:pStyle w:val="ListParagraph"/>
+        <w:numPr>
+          <w:ilvl w:val="2"/>
+          <w:numId w:val="5"/>
+        </w:numPr>
+      </w:pPr>
+      <w:r>
+        <w:t>calu3</w:t>
+      </w:r>
+    </w:p>
+    <w:p>
+      <w:pPr>
+        <w:pStyle w:val="ListParagraph"/>
+        <w:numPr>
+          <w:ilvl w:val="1"/>
+          <w:numId w:val="5"/>
+        </w:numPr>
+      </w:pPr>
+      <w:r>
+        <w:t>figures</w:t>
+      </w:r>
+    </w:p>
+    <w:p>
+      <w:pPr>
+        <w:pStyle w:val="ListParagraph"/>
+        <w:numPr>
+          <w:ilvl w:val="0"/>
+          <w:numId w:val="5"/>
+        </w:numPr>
+      </w:pPr>
+      <w:r>
+        <w:t>results</w:t>
+      </w:r>
+    </w:p>
+    <w:p>
+      <w:pPr>
+        <w:pStyle w:val="ListParagraph"/>
+        <w:numPr>
+          <w:ilvl w:val="1"/>
+          <w:numId w:val="5"/>
+        </w:numPr>
+      </w:pPr>
+      <w:proofErr w:type="spellStart"/>
+      <w:r>
+        <w:t>primaryHBEC</w:t>
+      </w:r>
+      <w:proofErr w:type="spellEnd"/>
+    </w:p>
+    <w:p>
+      <w:pPr>
+        <w:pStyle w:val="ListParagraph"/>
+        <w:numPr>
+          <w:ilvl w:val="1"/>
+          <w:numId w:val="5"/>
+        </w:numPr>
+      </w:pPr>
+      <w:r>
+        <w:t>calu3</w:t>
+      </w:r>
+    </w:p>
+    <w:p>
+      <w:pPr>
+        <w:pStyle w:val="ListParagraph"/>
+        <w:numPr>
+          <w:ilvl w:val="0"/>
+          <w:numId w:val="5"/>
+        </w:numPr>
+      </w:pPr>
+      <w:r>
+        <w:t>logs</w:t>
+      </w:r>
+    </w:p>
+    <w:p>
+      <w:pPr>
+        <w:pStyle w:val="ListParagraph"/>
+        <w:numPr>
+          <w:ilvl w:val="1"/>
+          <w:numId w:val="5"/>
+        </w:numPr>
+      </w:pPr>
+      <w:proofErr w:type="spellStart"/>
+      <w:r>
+        <w:t>primaryHBEC</w:t>
+      </w:r>
+      <w:proofErr w:type="spellEnd"/>
+    </w:p>
+    <w:p>
+      <w:pPr>
+        <w:pStyle w:val="ListParagraph"/>
+        <w:numPr>
+          <w:ilvl w:val="1"/>
+          <w:numId w:val="5"/>
+        </w:numPr>
+      </w:pPr>
+      <w:r>
+        <w:t>calu3</w:t>
+      </w:r>
+    </w:p>
+    <w:p>
+      <w:pPr>
+        <w:pStyle w:val="ListParagraph"/>
+        <w:numPr>
+          <w:ilvl w:val="1"/>
+          <w:numId w:val="5"/>
+        </w:numPr>
+      </w:pPr>
+      <w:r>
+        <w:t>run</w:t>
+      </w:r>
+    </w:p>
+    <w:p>
+      <w:pPr>
+        <w:pStyle w:val="ListParagraph"/>
+        <w:ind w:left="1440"/>
+      </w:pPr>
     </w:p>
     <w:sectPr>
       <w:pgSz w:w="11906" w:h="16838"/>
@@ -279,6 +812,119 @@
 <file path=word/numbering.xml><?xml version="1.0" encoding="utf-8"?>
 <w:numbering xmlns:wpc="http://schemas.microsoft.com/office/word/2010/wordprocessingCanvas" xmlns:cx="http://schemas.microsoft.com/office/drawing/2014/chartex" xmlns:cx1="http://schemas.microsoft.com/office/drawing/2015/9/8/chartex" xmlns:cx2="http://schemas.microsoft.com/office/drawing/2015/10/21/chartex" xmlns:cx3="http://schemas.microsoft.com/office/drawing/2016/5/9/chartex" xmlns:cx4="http://schemas.microsoft.com/office/drawing/2016/5/10/chartex" xmlns:cx5="http://schemas.microsoft.com/office/drawing/2016/5/11/chartex" xmlns:cx6="http://schemas.microsoft.com/office/drawing/2016/5/12/chartex" xmlns:cx7="http://schemas.microsoft.com/office/drawing/2016/5/13/chartex" xmlns:cx8="http://schemas.microsoft.com/office/drawing/2016/5/14/chartex" xmlns:mc="http://schemas.openxmlformats.org/markup-compatibility/2006" xmlns:m="http://schemas.openxmlformats.org/officeDocument/2006/math" xmlns:aink="http://schemas.microsoft.com/office/drawing/2016/ink" xmlns:am3d="http://schemas.microsoft.com/office/drawing/2017/model3d" xmlns:oel="http://schemas.microsoft.com/office/2019/extlst" xmlns:r="http://schemas.openxmlformats.org/officeDocument/2006/relationships" xmlns:wp14="http://schemas.microsoft.com/office/word/2010/wordprocessingDrawing" xmlns:wp="http://schemas.openxmlformats.org/drawingml/2006/wordprocessingDrawing" xmlns:wpg="http://schemas.microsoft.com/office/word/2010/wordprocessingGroup" xmlns:wpi="http://schemas.microsoft.com/office/word/2010/wordprocessingInk" xmlns:wps="http://schemas.microsoft.com/office/word/2010/wordprocessingShape" xmlns:o="urn:schemas-microsoft-com:office:office" xmlns:v="urn:schemas-microsoft-com:vml" xmlns:w10="urn:schemas-microsoft-com:office:word" xmlns:w="http://schemas.openxmlformats.org/wordprocessingml/2006/main" xmlns:w14="http://schemas.microsoft.com/office/word/2010/wordml" xmlns:w15="http://schemas.microsoft.com/office/word/2012/wordml" xmlns:w16cei="http://schemas.microsoft.com/office/word/2026/wordml/cei" xmlns:w16cex="http://schemas.microsoft.com/office/word/2018/wordml/cex" xmlns:w16cid="http://schemas.microsoft.com/office/word/2016/wordml/cid" xmlns:w16="http://schemas.microsoft.com/office/word/2018/wordml" xmlns:w16sdtdh="http://schemas.microsoft.com/office/word/2020/wordml/sdtdatahash" xmlns:w16sdtfl="http://schemas.microsoft.com/office/word/2024/wordml/sdtformatlock" xmlns:w16se="http://schemas.microsoft.com/office/word/2015/wordml/symex" xmlns:w16du="http://schemas.microsoft.com/office/word/2023/wordml/word16du" xmlns:wne="http://schemas.microsoft.com/office/word/2006/wordml" mc:Ignorable="w14 w15 w16se w16cid w16 w16cex w16sdtdh w16sdtfl w16du wp14">
   <w:abstractNum w:abstractNumId="0" w15:restartNumberingAfterBreak="0">
+    <w:nsid w:val="07905DED"/>
+    <w:multiLevelType w:val="hybridMultilevel"/>
+    <w:tmpl w:val="37648074"/>
+    <w:lvl w:ilvl="0" w:tplc="08090001">
+      <w:start w:val="1"/>
+      <w:numFmt w:val="bullet"/>
+      <w:lvlText w:val=""/>
+      <w:lvlJc w:val="left"/>
+      <w:pPr>
+        <w:ind w:left="720" w:hanging="360"/>
+      </w:pPr>
+      <w:rPr>
+        <w:rFonts w:ascii="Symbol" w:hAnsi="Symbol" w:hint="default"/>
+      </w:rPr>
+    </w:lvl>
+    <w:lvl w:ilvl="1" w:tplc="08090003" w:tentative="1">
+      <w:start w:val="1"/>
+      <w:numFmt w:val="bullet"/>
+      <w:lvlText w:val="o"/>
+      <w:lvlJc w:val="left"/>
+      <w:pPr>
+        <w:ind w:left="1440" w:hanging="360"/>
+      </w:pPr>
+      <w:rPr>
+        <w:rFonts w:ascii="Courier New" w:hAnsi="Courier New" w:cs="Courier New" w:hint="default"/>
+      </w:rPr>
+    </w:lvl>
+    <w:lvl w:ilvl="2" w:tplc="08090005" w:tentative="1">
+      <w:start w:val="1"/>
+      <w:numFmt w:val="bullet"/>
+      <w:lvlText w:val=""/>
+      <w:lvlJc w:val="left"/>
+      <w:pPr>
+        <w:ind w:left="2160" w:hanging="360"/>
+      </w:pPr>
+      <w:rPr>
+        <w:rFonts w:ascii="Wingdings" w:hAnsi="Wingdings" w:hint="default"/>
+      </w:rPr>
+    </w:lvl>
+    <w:lvl w:ilvl="3" w:tplc="08090001" w:tentative="1">
+      <w:start w:val="1"/>
+      <w:numFmt w:val="bullet"/>
+      <w:lvlText w:val=""/>
+      <w:lvlJc w:val="left"/>
+      <w:pPr>
+        <w:ind w:left="2880" w:hanging="360"/>
+      </w:pPr>
+      <w:rPr>
+        <w:rFonts w:ascii="Symbol" w:hAnsi="Symbol" w:hint="default"/>
+      </w:rPr>
+    </w:lvl>
+    <w:lvl w:ilvl="4" w:tplc="08090003" w:tentative="1">
+      <w:start w:val="1"/>
+      <w:numFmt w:val="bullet"/>
+      <w:lvlText w:val="o"/>
+      <w:lvlJc w:val="left"/>
+      <w:pPr>
+        <w:ind w:left="3600" w:hanging="360"/>
+      </w:pPr>
+      <w:rPr>
+        <w:rFonts w:ascii="Courier New" w:hAnsi="Courier New" w:cs="Courier New" w:hint="default"/>
+      </w:rPr>
+    </w:lvl>
+    <w:lvl w:ilvl="5" w:tplc="08090005" w:tentative="1">
+      <w:start w:val="1"/>
+      <w:numFmt w:val="bullet"/>
+      <w:lvlText w:val=""/>
+      <w:lvlJc w:val="left"/>
+      <w:pPr>
+        <w:ind w:left="4320" w:hanging="360"/>
+      </w:pPr>
+      <w:rPr>
+        <w:rFonts w:ascii="Wingdings" w:hAnsi="Wingdings" w:hint="default"/>
+      </w:rPr>
+    </w:lvl>
+    <w:lvl w:ilvl="6" w:tplc="08090001" w:tentative="1">
+      <w:start w:val="1"/>
+      <w:numFmt w:val="bullet"/>
+      <w:lvlText w:val=""/>
+      <w:lvlJc w:val="left"/>
+      <w:pPr>
+        <w:ind w:left="5040" w:hanging="360"/>
+      </w:pPr>
+      <w:rPr>
+        <w:rFonts w:ascii="Symbol" w:hAnsi="Symbol" w:hint="default"/>
+      </w:rPr>
+    </w:lvl>
+    <w:lvl w:ilvl="7" w:tplc="08090003" w:tentative="1">
+      <w:start w:val="1"/>
+      <w:numFmt w:val="bullet"/>
+      <w:lvlText w:val="o"/>
+      <w:lvlJc w:val="left"/>
+      <w:pPr>
+        <w:ind w:left="5760" w:hanging="360"/>
+      </w:pPr>
+      <w:rPr>
+        <w:rFonts w:ascii="Courier New" w:hAnsi="Courier New" w:cs="Courier New" w:hint="default"/>
+      </w:rPr>
+    </w:lvl>
+    <w:lvl w:ilvl="8" w:tplc="08090005" w:tentative="1">
+      <w:start w:val="1"/>
+      <w:numFmt w:val="bullet"/>
+      <w:lvlText w:val=""/>
+      <w:lvlJc w:val="left"/>
+      <w:pPr>
+        <w:ind w:left="6480" w:hanging="360"/>
+      </w:pPr>
+      <w:rPr>
+        <w:rFonts w:ascii="Wingdings" w:hAnsi="Wingdings" w:hint="default"/>
+      </w:rPr>
+    </w:lvl>
+  </w:abstractNum>
+  <w:abstractNum w:abstractNumId="1" w15:restartNumberingAfterBreak="0">
     <w:nsid w:val="0F8767C3"/>
     <w:multiLevelType w:val="hybridMultilevel"/>
     <w:tmpl w:val="DCD0D892"/>
@@ -391,7 +1037,7 @@
       </w:rPr>
     </w:lvl>
   </w:abstractNum>
-  <w:abstractNum w:abstractNumId="1" w15:restartNumberingAfterBreak="0">
+  <w:abstractNum w:abstractNumId="2" w15:restartNumberingAfterBreak="0">
     <w:nsid w:val="2A1221BB"/>
     <w:multiLevelType w:val="hybridMultilevel"/>
     <w:tmpl w:val="7E0CF6CC"/>
@@ -504,7 +1150,120 @@
       </w:rPr>
     </w:lvl>
   </w:abstractNum>
-  <w:abstractNum w:abstractNumId="2" w15:restartNumberingAfterBreak="0">
+  <w:abstractNum w:abstractNumId="3" w15:restartNumberingAfterBreak="0">
+    <w:nsid w:val="4B570C42"/>
+    <w:multiLevelType w:val="hybridMultilevel"/>
+    <w:tmpl w:val="03180352"/>
+    <w:lvl w:ilvl="0" w:tplc="08090001">
+      <w:start w:val="1"/>
+      <w:numFmt w:val="bullet"/>
+      <w:lvlText w:val=""/>
+      <w:lvlJc w:val="left"/>
+      <w:pPr>
+        <w:ind w:left="720" w:hanging="360"/>
+      </w:pPr>
+      <w:rPr>
+        <w:rFonts w:ascii="Symbol" w:hAnsi="Symbol" w:hint="default"/>
+      </w:rPr>
+    </w:lvl>
+    <w:lvl w:ilvl="1" w:tplc="08090003">
+      <w:start w:val="1"/>
+      <w:numFmt w:val="bullet"/>
+      <w:lvlText w:val="o"/>
+      <w:lvlJc w:val="left"/>
+      <w:pPr>
+        <w:ind w:left="1440" w:hanging="360"/>
+      </w:pPr>
+      <w:rPr>
+        <w:rFonts w:ascii="Courier New" w:hAnsi="Courier New" w:cs="Courier New" w:hint="default"/>
+      </w:rPr>
+    </w:lvl>
+    <w:lvl w:ilvl="2" w:tplc="08090005">
+      <w:start w:val="1"/>
+      <w:numFmt w:val="bullet"/>
+      <w:lvlText w:val=""/>
+      <w:lvlJc w:val="left"/>
+      <w:pPr>
+        <w:ind w:left="2160" w:hanging="360"/>
+      </w:pPr>
+      <w:rPr>
+        <w:rFonts w:ascii="Wingdings" w:hAnsi="Wingdings" w:hint="default"/>
+      </w:rPr>
+    </w:lvl>
+    <w:lvl w:ilvl="3" w:tplc="08090001" w:tentative="1">
+      <w:start w:val="1"/>
+      <w:numFmt w:val="bullet"/>
+      <w:lvlText w:val=""/>
+      <w:lvlJc w:val="left"/>
+      <w:pPr>
+        <w:ind w:left="2880" w:hanging="360"/>
+      </w:pPr>
+      <w:rPr>
+        <w:rFonts w:ascii="Symbol" w:hAnsi="Symbol" w:hint="default"/>
+      </w:rPr>
+    </w:lvl>
+    <w:lvl w:ilvl="4" w:tplc="08090003" w:tentative="1">
+      <w:start w:val="1"/>
+      <w:numFmt w:val="bullet"/>
+      <w:lvlText w:val="o"/>
+      <w:lvlJc w:val="left"/>
+      <w:pPr>
+        <w:ind w:left="3600" w:hanging="360"/>
+      </w:pPr>
+      <w:rPr>
+        <w:rFonts w:ascii="Courier New" w:hAnsi="Courier New" w:cs="Courier New" w:hint="default"/>
+      </w:rPr>
+    </w:lvl>
+    <w:lvl w:ilvl="5" w:tplc="08090005" w:tentative="1">
+      <w:start w:val="1"/>
+      <w:numFmt w:val="bullet"/>
+      <w:lvlText w:val=""/>
+      <w:lvlJc w:val="left"/>
+      <w:pPr>
+        <w:ind w:left="4320" w:hanging="360"/>
+      </w:pPr>
+      <w:rPr>
+        <w:rFonts w:ascii="Wingdings" w:hAnsi="Wingdings" w:hint="default"/>
+      </w:rPr>
+    </w:lvl>
+    <w:lvl w:ilvl="6" w:tplc="08090001" w:tentative="1">
+      <w:start w:val="1"/>
+      <w:numFmt w:val="bullet"/>
+      <w:lvlText w:val=""/>
+      <w:lvlJc w:val="left"/>
+      <w:pPr>
+        <w:ind w:left="5040" w:hanging="360"/>
+      </w:pPr>
+      <w:rPr>
+        <w:rFonts w:ascii="Symbol" w:hAnsi="Symbol" w:hint="default"/>
+      </w:rPr>
+    </w:lvl>
+    <w:lvl w:ilvl="7" w:tplc="08090003" w:tentative="1">
+      <w:start w:val="1"/>
+      <w:numFmt w:val="bullet"/>
+      <w:lvlText w:val="o"/>
+      <w:lvlJc w:val="left"/>
+      <w:pPr>
+        <w:ind w:left="5760" w:hanging="360"/>
+      </w:pPr>
+      <w:rPr>
+        <w:rFonts w:ascii="Courier New" w:hAnsi="Courier New" w:cs="Courier New" w:hint="default"/>
+      </w:rPr>
+    </w:lvl>
+    <w:lvl w:ilvl="8" w:tplc="08090005" w:tentative="1">
+      <w:start w:val="1"/>
+      <w:numFmt w:val="bullet"/>
+      <w:lvlText w:val=""/>
+      <w:lvlJc w:val="left"/>
+      <w:pPr>
+        <w:ind w:left="6480" w:hanging="360"/>
+      </w:pPr>
+      <w:rPr>
+        <w:rFonts w:ascii="Wingdings" w:hAnsi="Wingdings" w:hint="default"/>
+      </w:rPr>
+    </w:lvl>
+  </w:abstractNum>
+  <w:abstractNum w:abstractNumId="4" w15:restartNumberingAfterBreak="0">
     <w:nsid w:val="692B5E95"/>
     <w:multiLevelType w:val="hybridMultilevel"/>
     <w:tmpl w:val="6AD03B7C"/>
@@ -617,7 +1376,7 @@
       </w:rPr>
     </w:lvl>
   </w:abstractNum>
-  <w:abstractNum w:abstractNumId="3" w15:restartNumberingAfterBreak="0">
+  <w:abstractNum w:abstractNumId="5" w15:restartNumberingAfterBreak="0">
     <w:nsid w:val="746A5C0A"/>
     <w:multiLevelType w:val="hybridMultilevel"/>
     <w:tmpl w:val="50DEA51A"/>
@@ -731,15 +1490,21 @@
     </w:lvl>
   </w:abstractNum>
   <w:num w:numId="1" w16cid:durableId="853226515">
+    <w:abstractNumId w:val="5"/>
+  </w:num>
+  <w:num w:numId="2" w16cid:durableId="1597787845">
+    <w:abstractNumId w:val="2"/>
+  </w:num>
+  <w:num w:numId="3" w16cid:durableId="1477526337">
+    <w:abstractNumId w:val="4"/>
+  </w:num>
+  <w:num w:numId="4" w16cid:durableId="2027368701">
+    <w:abstractNumId w:val="1"/>
+  </w:num>
+  <w:num w:numId="5" w16cid:durableId="1219586126">
     <w:abstractNumId w:val="3"/>
   </w:num>
-  <w:num w:numId="2" w16cid:durableId="1597787845">
-    <w:abstractNumId w:val="1"/>
-  </w:num>
-  <w:num w:numId="3" w16cid:durableId="1477526337">
-    <w:abstractNumId w:val="2"/>
-  </w:num>
-  <w:num w:numId="4" w16cid:durableId="2027368701">
+  <w:num w:numId="6" w16cid:durableId="663246283">
     <w:abstractNumId w:val="0"/>
   </w:num>
 </w:numbering>

</xml_diff>